<commit_message>
docs(weekly): chinh sua bao cao hang tuan cua tuan 1 va tuan 2
</commit_message>
<xml_diff>
--- a/docs/management/weekly/Report Week 1 Group 13.docx
+++ b/docs/management/weekly/Report Week 1 Group 13.docx
@@ -368,7 +368,7 @@
           <w:color w:val="000000"/>
           <w:szCs w:val="18"/>
         </w:rPr>
-        <w:t>24120448</w:t>
+        <w:t>24120368</w:t>
       </w:r>
       <w:r>
         <w:rPr>
@@ -377,16 +377,7 @@
           <w:color w:val="000000"/>
           <w:szCs w:val="18"/>
         </w:rPr>
-        <w:t xml:space="preserve"> </w:t>
-      </w:r>
-      <w:r>
-        <w:rPr>
-          <w:rFonts w:ascii="Arial" w:eastAsia="Times New Roman" w:hAnsi="Arial" w:cs="Arial"/>
-          <w:bCs/>
-          <w:color w:val="000000"/>
-          <w:szCs w:val="18"/>
-        </w:rPr>
-        <w:t>–</w:t>
+        <w:t xml:space="preserve"> –</w:t>
       </w:r>
       <w:r>
         <w:rPr>
@@ -440,7 +431,7 @@
           <w:color w:val="000000"/>
           <w:szCs w:val="18"/>
         </w:rPr>
-        <w:t>24120443</w:t>
+        <w:t>24120318</w:t>
       </w:r>
       <w:r>
         <w:rPr>
@@ -542,7 +533,7 @@
           <w:color w:val="000000"/>
           <w:szCs w:val="18"/>
         </w:rPr>
-        <w:t>24120464</w:t>
+        <w:t>24120420</w:t>
       </w:r>
       <w:r>
         <w:rPr>
@@ -551,16 +542,7 @@
           <w:color w:val="000000"/>
           <w:szCs w:val="18"/>
         </w:rPr>
-        <w:t xml:space="preserve"> </w:t>
-      </w:r>
-      <w:r>
-        <w:rPr>
-          <w:rFonts w:ascii="Arial" w:eastAsia="Times New Roman" w:hAnsi="Arial" w:cs="Arial"/>
-          <w:bCs/>
-          <w:color w:val="000000"/>
-          <w:szCs w:val="18"/>
-        </w:rPr>
-        <w:t>–</w:t>
+        <w:t xml:space="preserve"> –</w:t>
       </w:r>
       <w:r>
         <w:rPr>
@@ -617,7 +599,7 @@
           <w:color w:val="000000"/>
           <w:szCs w:val="18"/>
         </w:rPr>
-        <w:t>24120475</w:t>
+        <w:t>24120471</w:t>
       </w:r>
       <w:r>
         <w:rPr>

</xml_diff>